<commit_message>
feat: add image layout options for BAPP Termin 2 and implement related tests
</commit_message>
<xml_diff>
--- a/template/03. Template BAPP T2 PPL .docx
+++ b/template/03. Template BAPP T2 PPL .docx
@@ -889,25 +889,7 @@
           <w:sz w:val="24"/>
           <w:szCs w:val="24"/>
         </w:rPr>
-        <w:t xml:space="preserve"> </w:t>
-      </w:r>
-      <w:proofErr w:type="spellStart"/>
-      <w:r>
-        <w:rPr>
-          <w:rFonts w:ascii="Bookman Old Style" w:eastAsia="Bookman Old Style" w:hAnsi="Bookman Old Style" w:cs="Bookman Old Style"/>
-          <w:sz w:val="24"/>
-          <w:szCs w:val="24"/>
-        </w:rPr>
-        <w:t>hal</w:t>
-      </w:r>
-      <w:proofErr w:type="spellEnd"/>
-      <w:r>
-        <w:rPr>
-          <w:rFonts w:ascii="Bookman Old Style" w:eastAsia="Bookman Old Style" w:hAnsi="Bookman Old Style" w:cs="Bookman Old Style"/>
-          <w:sz w:val="24"/>
-          <w:szCs w:val="24"/>
-        </w:rPr>
-        <w:t xml:space="preserve"> </w:t>
+        <w:t xml:space="preserve"> hal </w:t>
       </w:r>
       <w:proofErr w:type="spellStart"/>
       <w:r>
@@ -5685,11 +5667,6 @@
           <w:sz w:val="24"/>
           <w:szCs w:val="24"/>
         </w:rPr>
-        <w:sectPr>
-          <w:pgSz w:w="15840" w:h="12240" w:orient="landscape"/>
-          <w:pgMar w:top="1440" w:right="1440" w:bottom="1440" w:left="1440" w:header="708" w:footer="708" w:gutter="0"/>
-          <w:cols w:space="720"/>
-        </w:sectPr>
       </w:pPr>
       <w:r>
         <w:rPr>
@@ -5703,9 +5680,28 @@
     </w:p>
     <w:p>
       <w:pPr>
-        <w:widowControl w:val="0"/>
+        <w:rPr>
+          <w:rFonts w:ascii="Bookman Old Style" w:eastAsia="Bookman Old Style" w:hAnsi="Bookman Old Style" w:cs="Bookman Old Style"/>
+          <w:color w:val="FF0000"/>
+          <w:sz w:val="24"/>
+          <w:szCs w:val="24"/>
+        </w:rPr>
+      </w:pPr>
+      <w:r>
+        <w:rPr>
+          <w:rFonts w:ascii="Bookman Old Style" w:eastAsia="Bookman Old Style" w:hAnsi="Bookman Old Style" w:cs="Bookman Old Style"/>
+          <w:color w:val="FF0000"/>
+          <w:sz w:val="24"/>
+          <w:szCs w:val="24"/>
+        </w:rPr>
+        <w:br w:type="page"/>
+      </w:r>
+    </w:p>
+    <w:p>
+      <w:pPr>
         <w:spacing w:after="0" w:line="240" w:lineRule="auto"/>
         <w:ind w:left="360"/>
+        <w:jc w:val="center"/>
         <w:rPr>
           <w:rFonts w:ascii="Bookman Old Style" w:eastAsia="Bookman Old Style" w:hAnsi="Bookman Old Style" w:cs="Bookman Old Style"/>
           <w:sz w:val="24"/>

</xml_diff>